<commit_message>
New dashboard now at project level
</commit_message>
<xml_diff>
--- a/public/data/example-template.docx
+++ b/public/data/example-template.docx
@@ -1607,304 +1607,33 @@
       </w:r>
       <w:bookmarkEnd w:id="13"/>
     </w:p>
-    <w:tbl>
-      <w:tblPr>
-        <w:tblStyle w:val="a"/>
-        <w:tblW w:w="9570" w:type="dxa"/>
-        <w:tblInd w:w="6" w:type="dxa"/>
-        <w:tblBorders>
-          <w:top w:val="single" w:sz="8" w:space="0" w:color="000000"/>
-          <w:left w:val="single" w:sz="8" w:space="0" w:color="000000"/>
-          <w:bottom w:val="single" w:sz="8" w:space="0" w:color="000000"/>
-          <w:right w:val="single" w:sz="8" w:space="0" w:color="000000"/>
-          <w:insideH w:val="single" w:sz="8" w:space="0" w:color="000000"/>
-          <w:insideV w:val="single" w:sz="8" w:space="0" w:color="000000"/>
-        </w:tblBorders>
-        <w:tblLayout w:type="fixed"/>
-        <w:tblLook w:val="0600" w:firstRow="0" w:lastRow="0" w:firstColumn="0" w:lastColumn="0" w:noHBand="1" w:noVBand="1"/>
-      </w:tblPr>
-      <w:tblGrid>
-        <w:gridCol w:w="4605"/>
-        <w:gridCol w:w="4965"/>
-      </w:tblGrid>
-      <w:tr>
-        <w:tc>
-          <w:tcPr>
-            <w:tcW w:w="4605" w:type="dxa"/>
-            <w:tcBorders>
-              <w:bottom w:val="single" w:sz="4" w:space="0" w:color="000000"/>
-            </w:tcBorders>
-            <w:shd w:val="clear" w:color="auto" w:fill="072589"/>
-            <w:tcMar>
-              <w:top w:w="100" w:type="dxa"/>
-              <w:left w:w="100" w:type="dxa"/>
-              <w:bottom w:w="100" w:type="dxa"/>
-              <w:right w:w="100" w:type="dxa"/>
-            </w:tcMar>
-          </w:tcPr>
-          <w:p>
-            <w:pPr>
-              <w:spacing w:after="0" w:line="240" w:lineRule="auto"/>
-              <w:ind w:left="0" w:right="0"/>
-              <w:rPr>
-                <w:b/>
-                <w:color w:val="FFFFFF"/>
-              </w:rPr>
-            </w:pPr>
-            <w:r>
-              <w:rPr>
-                <w:b/>
-                <w:color w:val="FFFFFF"/>
-              </w:rPr>
-              <w:t>Risks</w:t>
-            </w:r>
-          </w:p>
-        </w:tc>
-        <w:tc>
-          <w:tcPr>
-            <w:tcW w:w="4965" w:type="dxa"/>
-            <w:tcBorders>
-              <w:bottom w:val="single" w:sz="4" w:space="0" w:color="000000"/>
-            </w:tcBorders>
-            <w:shd w:val="clear" w:color="auto" w:fill="072589"/>
-            <w:tcMar>
-              <w:top w:w="100" w:type="dxa"/>
-              <w:left w:w="100" w:type="dxa"/>
-              <w:bottom w:w="100" w:type="dxa"/>
-              <w:right w:w="100" w:type="dxa"/>
-            </w:tcMar>
-          </w:tcPr>
-          <w:p>
-            <w:pPr>
-              <w:spacing w:after="0" w:line="240" w:lineRule="auto"/>
-              <w:ind w:left="0" w:right="0"/>
-              <w:rPr>
-                <w:b/>
-                <w:color w:val="FFFFFF"/>
-              </w:rPr>
-            </w:pPr>
-            <w:r>
-              <w:rPr>
-                <w:b/>
-                <w:color w:val="FFFFFF"/>
-              </w:rPr>
-              <w:t>Stats (average)</w:t>
-            </w:r>
-          </w:p>
-        </w:tc>
-      </w:tr>
-      <w:tr>
-        <w:tc>
-          <w:tcPr>
-            <w:tcW w:w="4605" w:type="dxa"/>
-            <w:tcBorders>
-              <w:bottom w:val="single" w:sz="4" w:space="0" w:color="000000"/>
-            </w:tcBorders>
-            <w:tcMar>
-              <w:top w:w="100" w:type="dxa"/>
-              <w:left w:w="100" w:type="dxa"/>
-              <w:bottom w:w="100" w:type="dxa"/>
-              <w:right w:w="100" w:type="dxa"/>
-            </w:tcMar>
-          </w:tcPr>
-          <w:p>
-            <w:pPr>
-              <w:pBdr>
-                <w:top w:val="nil"/>
-                <w:left w:val="nil"/>
-                <w:bottom w:val="nil"/>
-                <w:right w:val="nil"/>
-                <w:between w:val="nil"/>
-              </w:pBdr>
-              <w:spacing w:after="0" w:line="240" w:lineRule="auto"/>
-              <w:ind w:left="0" w:right="0"/>
-              <w:rPr>
-                <w:b/>
-              </w:rPr>
-            </w:pPr>
-          </w:p>
-          <w:p>
-            <w:pPr>
-              <w:pBdr>
-                <w:top w:val="nil"/>
-                <w:left w:val="nil"/>
-                <w:bottom w:val="nil"/>
-                <w:right w:val="nil"/>
-                <w:between w:val="nil"/>
-              </w:pBdr>
-              <w:spacing w:after="0" w:line="240" w:lineRule="auto"/>
-              <w:ind w:left="0" w:right="0"/>
-              <w:jc w:val="center"/>
-            </w:pPr>
-            <w:r>
-              <w:rPr>
-                <w:noProof/>
-              </w:rPr>
-              <w:t>{{donutChart}}</w:t>
-            </w:r>
-          </w:p>
-        </w:tc>
-        <w:tc>
-          <w:tcPr>
-            <w:tcW w:w="4965" w:type="dxa"/>
-            <w:tcBorders>
-              <w:bottom w:val="single" w:sz="4" w:space="0" w:color="000000"/>
-            </w:tcBorders>
-            <w:tcMar>
-              <w:top w:w="100" w:type="dxa"/>
-              <w:left w:w="100" w:type="dxa"/>
-              <w:bottom w:w="100" w:type="dxa"/>
-              <w:right w:w="100" w:type="dxa"/>
-            </w:tcMar>
-          </w:tcPr>
-          <w:p>
-            <w:pPr>
-              <w:rPr>
-                <w:b/>
-                <w:bCs/>
-                <w:color w:val="002060"/>
-              </w:rPr>
-            </w:pPr>
-            <w:r>
-              <w:rPr>
-                <w:b/>
-                <w:bCs/>
-                <w:color w:val="002060"/>
-              </w:rPr>
-              <w:t>Likelihood</w:t>
-            </w:r>
-          </w:p>
-          <w:p>
-            <w:pPr>
-              <w:shd w:val="clear" w:color="auto" w:fill="F5F5F5"/>
-              <w:spacing w:after="160" w:line="327" w:lineRule="auto"/>
-              <w:ind w:left="0" w:right="0"/>
-              <w:jc w:val="center"/>
-              <w:rPr>
-                <w:rFonts w:ascii="Arial" w:eastAsia="Arial" w:hAnsi="Arial" w:cs="Arial"/>
-              </w:rPr>
-            </w:pPr>
-            <w:r>
-              <w:rPr>
-                <w:rFonts w:ascii="Arial" w:eastAsia="Arial" w:hAnsi="Arial" w:cs="Arial"/>
-              </w:rPr>
-              <w:t>{{</w:t>
-            </w:r>
-            <w:proofErr w:type="spellStart"/>
-            <w:r>
-              <w:rPr>
-                <w:rFonts w:ascii="Arial" w:eastAsia="Arial" w:hAnsi="Arial" w:cs="Arial"/>
-              </w:rPr>
-              <w:t>averageLikelihood</w:t>
-            </w:r>
-            <w:proofErr w:type="spellEnd"/>
-            <w:r>
-              <w:rPr>
-                <w:rFonts w:ascii="Arial" w:eastAsia="Arial" w:hAnsi="Arial" w:cs="Arial"/>
-              </w:rPr>
-              <w:t>}}</w:t>
-            </w:r>
-          </w:p>
-          <w:p>
-            <w:pPr>
-              <w:rPr>
-                <w:b/>
-                <w:bCs/>
-                <w:color w:val="002060"/>
-              </w:rPr>
-            </w:pPr>
-            <w:r>
-              <w:rPr>
-                <w:b/>
-                <w:bCs/>
-                <w:color w:val="002060"/>
-              </w:rPr>
-              <w:t>Impact</w:t>
-            </w:r>
-          </w:p>
-          <w:p>
-            <w:pPr>
-              <w:shd w:val="clear" w:color="auto" w:fill="F5F5F5"/>
-              <w:spacing w:after="160" w:line="327" w:lineRule="auto"/>
-              <w:ind w:left="0" w:right="0"/>
-              <w:jc w:val="center"/>
-              <w:rPr>
-                <w:rFonts w:ascii="Arial" w:eastAsia="Arial" w:hAnsi="Arial" w:cs="Arial"/>
-              </w:rPr>
-            </w:pPr>
-            <w:r>
-              <w:rPr>
-                <w:rFonts w:ascii="Arial" w:eastAsia="Arial" w:hAnsi="Arial" w:cs="Arial"/>
-              </w:rPr>
-              <w:t>{{</w:t>
-            </w:r>
-            <w:proofErr w:type="spellStart"/>
-            <w:r>
-              <w:rPr>
-                <w:rFonts w:ascii="Arial" w:eastAsia="Arial" w:hAnsi="Arial" w:cs="Arial"/>
-              </w:rPr>
-              <w:t>averageImpact</w:t>
-            </w:r>
-            <w:proofErr w:type="spellEnd"/>
-            <w:r>
-              <w:rPr>
-                <w:rFonts w:ascii="Arial" w:eastAsia="Arial" w:hAnsi="Arial" w:cs="Arial"/>
-              </w:rPr>
-              <w:t>}}</w:t>
-            </w:r>
-          </w:p>
-          <w:p>
-            <w:pPr>
-              <w:rPr>
-                <w:b/>
-                <w:bCs/>
-                <w:color w:val="002060"/>
-              </w:rPr>
-            </w:pPr>
-            <w:r>
-              <w:rPr>
-                <w:b/>
-                <w:bCs/>
-                <w:color w:val="002060"/>
-              </w:rPr>
-              <w:t>Risk</w:t>
-            </w:r>
-          </w:p>
-          <w:p>
-            <w:pPr>
-              <w:shd w:val="clear" w:color="auto" w:fill="F5F5F5"/>
-              <w:spacing w:after="160" w:line="327" w:lineRule="auto"/>
-              <w:ind w:left="0" w:right="0"/>
-              <w:jc w:val="center"/>
-              <w:rPr>
-                <w:rFonts w:ascii="Arial" w:eastAsia="Arial" w:hAnsi="Arial" w:cs="Arial"/>
-              </w:rPr>
-            </w:pPr>
-            <w:r>
-              <w:rPr>
-                <w:rFonts w:ascii="Arial" w:eastAsia="Arial" w:hAnsi="Arial" w:cs="Arial"/>
-              </w:rPr>
-              <w:t>{{</w:t>
-            </w:r>
-            <w:proofErr w:type="spellStart"/>
-            <w:r>
-              <w:rPr>
-                <w:rFonts w:ascii="Arial" w:eastAsia="Arial" w:hAnsi="Arial" w:cs="Arial"/>
-              </w:rPr>
-              <w:t>averageRisk</w:t>
-            </w:r>
-            <w:proofErr w:type="spellEnd"/>
-            <w:r>
-              <w:rPr>
-                <w:rFonts w:ascii="Arial" w:eastAsia="Arial" w:hAnsi="Arial" w:cs="Arial"/>
-              </w:rPr>
-              <w:t>}}</w:t>
-            </w:r>
-          </w:p>
-        </w:tc>
-      </w:tr>
-    </w:tbl>
+    <w:p>
+      <w:pPr>
+        <w:rPr>
+          <w:noProof/>
+        </w:rPr>
+      </w:pPr>
+      <w:r>
+        <w:rPr>
+          <w:noProof/>
+        </w:rPr>
+        <w:t>{{riskCountsSummary}}</w:t>
+      </w:r>
+    </w:p>
+    <w:p>
+      <w:r>
+        <w:rPr>
+          <w:noProof/>
+        </w:rPr>
+        <w:t>{{riskMatrixChart}}</w:t>
+      </w:r>
+    </w:p>
     <w:p/>
+    <w:p>
+      <w:pPr>
+        <w:ind w:left="0"/>
+      </w:pPr>
+    </w:p>
     <w:p>
       <w:pPr>
         <w:pStyle w:val="Heading2"/>
@@ -1953,6 +1682,24 @@
         <w:t>Risk management table</w:t>
       </w:r>
       <w:bookmarkEnd w:id="16"/>
+    </w:p>
+    <w:p>
+      <w:r>
+        <w:t>{{</w:t>
+      </w:r>
+      <w:proofErr w:type="spellStart"/>
+      <w:r>
+        <w:t>riskEntryMatrix</w:t>
+      </w:r>
+      <w:proofErr w:type="spellEnd"/>
+      <w:r>
+        <w:t>}}</w:t>
+      </w:r>
+    </w:p>
+    <w:p>
+      <w:r>
+        <w:br w:type="page"/>
+      </w:r>
     </w:p>
     <w:p>
       <w:r>

</xml_diff>

<commit_message>
Adding better template handling and updating the guide
</commit_message>
<xml_diff>
--- a/public/data/example-template.docx
+++ b/public/data/example-template.docx
@@ -128,19 +128,11 @@
         <w:ind w:left="0" w:right="0"/>
         <w:textDirection w:val="btLr"/>
       </w:pPr>
-      <w:proofErr w:type="gramStart"/>
       <w:r>
         <w:rPr>
           <w:sz w:val="24"/>
         </w:rPr>
-        <w:t>Published: {{</w:t>
-      </w:r>
-      <w:proofErr w:type="gramEnd"/>
-      <w:r>
-        <w:rPr>
-          <w:sz w:val="24"/>
-        </w:rPr>
-        <w:t>date}}</w:t>
+        <w:t>Published: {{date}}</w:t>
       </w:r>
     </w:p>
     <w:p>
@@ -1628,7 +1620,6 @@
         <w:t>{{riskMatrixChart}}</w:t>
       </w:r>
     </w:p>
-    <w:p/>
     <w:p>
       <w:pPr>
         <w:ind w:left="0"/>
@@ -2815,7 +2806,6 @@
   <w:style w:type="character" w:default="1" w:styleId="DefaultParagraphFont">
     <w:name w:val="Default Paragraph Font"/>
     <w:uiPriority w:val="1"/>
-    <w:semiHidden/>
     <w:unhideWhenUsed/>
   </w:style>
   <w:style w:type="table" w:default="1" w:styleId="TableNormal">

</xml_diff>